<commit_message>
docs: align LZ 4 scenarios with methodology
</commit_message>
<xml_diff>
--- a/docs/requirements/lz4-enuway-requirements.docx
+++ b/docs/requirements/lz4-enuway-requirements.docx
@@ -8613,7 +8613,7 @@
               </w:rPr>
               <w:t>Оң сценарий: Given қолданушыда жарамды ENU поштасы бар; When растау сілтемесін қолданады; Then профиль verified мәртебесімен ашылады. Жарамсыз домен қабылданбайды.</w:t>
               <w:br/>
-              <w:t>Теріс сценарий: Дано: домен почты не относится к ENU; Когда пользователь отправляет регистрацию; Тогда система отклоняет запрос и не создаёт аккаунт.</w:t>
+              <w:t>Теріс сценарий: Given пошта домені ENU-ға тиесілі емес; When пайдаланушы тіркелуді жібереді; Then жүйе сұрауды қабылдамайды және аккаунт құрмайды.</w:t>
             </w:r>
           </w:p>
         </w:tc>
@@ -8795,7 +8795,7 @@
               </w:rPr>
               <w:t>Оң сценарий: Given verified аккаунт; When міндетті өрістерді толтырып сақтайды; Then профиль ашылады және нақты үй мекенжайы жарияланбайды.</w:t>
               <w:br/>
-              <w:t>Теріс сценарий: Дано: обязательное поле профиля пустое; Когда пользователь сохраняет профиль; Тогда система показывает ошибку и не публикует профиль.</w:t>
+              <w:t>Теріс сценарий: Given профильдің міндетті өрісі бос; When пайдаланушы профильді сақтайды; Then жүйе қатені көрсетеді және профильді жарияламайды.</w:t>
             </w:r>
           </w:p>
         </w:tc>
@@ -8977,7 +8977,7 @@
               </w:rPr>
               <w:t>Оң сценарий: Given белсенді сапарлар бар; When бастапқы аудан, межелі орын және күнді таңдайды; Then сәйкес нәтижелер уақыт бойынша сұрыпталып көрсетіледі.</w:t>
               <w:br/>
-              <w:t>Теріс сценарий: Дано: по выбранным параметрам поездок нет; Когда пользователь выполняет поиск; Тогда система показывает пустой результат и предлагает изменить фильтры.</w:t>
+              <w:t>Теріс сценарий: Given таңдалған параметрлер бойынша сапар жоқ; When пайдаланушы іздеу жасайды; Then жүйе бос нәтиже көрсетіп, сүзгілерді өзгертуді ұсынады.</w:t>
             </w:r>
           </w:p>
         </w:tc>
@@ -9159,7 +9159,7 @@
               </w:rPr>
               <w:t>Оң сценарий: Given іздеу нәтижесі ашық; When карточканы таңдайды; Then уақыт, кездесу нүктесі, бос орын, болжамды үлес және verified мәртебесі көрсетіледі.</w:t>
               <w:br/>
-              <w:t>Теріс сценарий: Дано: поездка закрыта или мест нет; Когда пользователь открывает карточку; Тогда кнопка присоединения недоступна и указана причина.</w:t>
+              <w:t>Теріс сценарий: Given сапар жабық немесе бос орын жоқ; When пайдаланушы карточканы ашады; Then қосылу батырмасы қолжетімсіз болып, себебі көрсетіледі.</w:t>
             </w:r>
           </w:p>
         </w:tc>
@@ -9341,7 +9341,7 @@
               </w:rPr>
               <w:t>Оң сценарий: Given verified жүргізуші; When барлық міндетті өрісті толтырады; Then сапар Draft ретінде сақталып, тексеруге көрсетіледі.</w:t>
               <w:br/>
-              <w:t>Теріс сценарий: Дано: обязательные данные поездки не заполнены; Когда водитель пытается опубликовать поездку; Тогда система сохраняет черновик и показывает ошибки.</w:t>
+              <w:t>Теріс сценарий: Given сапардың міндетті деректері толтырылмаған; When жүргізуші жариялауға әрекет жасайды; Then жүйе черновикті сақтап, қателерді көрсетеді.</w:t>
             </w:r>
           </w:p>
         </w:tc>
@@ -9523,7 +9523,7 @@
               </w:rPr>
               <w:t>Оң сценарий: Given сапар Draft күйінде; When 1–4 аралығындағы орын санын енгізеді; Then жүйе мәнді сақтайды, ал басқа мәндерді қате деп көрсетеді.</w:t>
               <w:br/>
-              <w:t>Теріс сценарий: Дано: введено меньше 1 или больше 4 мест; Когда водитель сохраняет поездку; Тогда значение отклоняется и показывается допустимый диапазон.</w:t>
+              <w:t>Теріс сценарий: Given 1-ден аз немесе 4-тен көп орын енгізілген; When жүргізуші сапарды сақтайды; Then мән қабылданбай, рұқсат етілген диапазон көрсетіледі.</w:t>
             </w:r>
           </w:p>
         </w:tc>
@@ -9705,7 +9705,7 @@
               </w:rPr>
               <w:t>Оң сценарий: Given сапар Draft күйінде; When 0–5000 теңге аралығындағы соманы енгізеді; Then сома карточкада болжамды үлес ретінде көрсетіледі.</w:t>
               <w:br/>
-              <w:t>Теріс сценарий: Дано: сумма меньше 0 или больше 5000 тенге; Когда водитель сохраняет сумму; Тогда система отклоняет значение.</w:t>
+              <w:t>Теріс сценарий: Given сома 0-ден аз немесе 5000 теңгеден көп; When жүргізуші соманы сақтайды; Then жүйе мәнді қабылдамайды.</w:t>
             </w:r>
           </w:p>
         </w:tc>
@@ -9887,7 +9887,7 @@
               </w:rPr>
               <w:t>Оң сценарий: Given verified жолаушы және бос орын бар; When Қосылу батырмасын басады; Then сұрау Pending күйінде жасалып, жүргізушіге хабарлама жіберіледі.</w:t>
               <w:br/>
-              <w:t>Теріс сценарий: Дано: свободных мест нет; Когда пассажир отправляет запрос; Тогда запрос не создаётся и отображается сообщение об отсутствии мест.</w:t>
+              <w:t>Теріс сценарий: Given бос орын жоқ; When жолаушы сұрау жібереді; Then сұрау құрылмайды және орын жоқ екені көрсетіледі.</w:t>
             </w:r>
           </w:p>
         </w:tc>
@@ -10069,7 +10069,7 @@
               </w:rPr>
               <w:t>Оң сценарий: Given Pending сұрау бар; When жүргізуші шешім таңдайды; Then мәртебе жаңарып, жолаушыға хабарлама кетеді; қабылданса бос орын 1-ге азаяды.</w:t>
               <w:br/>
-              <w:t>Теріс сценарий: Дано: запрос уже обработан; Когда водитель повторно принимает или отклоняет его; Тогда статус и число мест не меняются.</w:t>
+              <w:t>Теріс сценарий: Given сұрау бұрын өңделген; When жүргізуші оны қайта қабылдайды немесе қабылдамайды; Then мәртебе мен орын саны өзгермейді.</w:t>
             </w:r>
           </w:p>
         </w:tc>
@@ -10251,7 +10251,7 @@
               </w:rPr>
               <w:t>Оң сценарий: Given қолданушы жүйеге кірген; When Менің сапарларым бөлімін ашады; Then сапарлар Алдағы және Өткен топтарында көрсетіледі.</w:t>
               <w:br/>
-              <w:t>Теріс сценарий: Дано: у пользователя нет поездок; Когда он открывает раздел; Тогда система показывает пустое состояние без ошибки.</w:t>
+              <w:t>Теріс сценарий: Given пайдаланушыда сапар жоқ; When ол бөлімді ашады; Then жүйе қатесіз бос күйді көрсетеді.</w:t>
             </w:r>
           </w:p>
         </w:tc>
@@ -10433,7 +10433,7 @@
               </w:rPr>
               <w:t>Оң сценарий: Given алдағы сапар бар; When Бас тарту әрекетін растайды; Then мәртебе жаңарып, басқа қатысушыларға 60 секунд ішінде хабарлама жіберіледі.</w:t>
               <w:br/>
-              <w:t>Теріс сценарий: Дано: поездка завершена; Когда участник пытается отменить участие; Тогда отмена блокируется и статус не меняется.</w:t>
+              <w:t>Теріс сценарий: Given сапар аяқталған; When қатысушы бас тартуға әрекет жасайды; Then әрекет бұғатталып, мәртебе өзгермейді.</w:t>
             </w:r>
           </w:p>
         </w:tc>
@@ -10615,7 +10615,7 @@
               </w:rPr>
               <w:t>Оң сценарий: Given сапар уақыты өтіп кеткен; When жүргізуші Аяқталды деп белгілейді; Then сапар Completed күйіне ауысып, бағалау ашылады.</w:t>
               <w:br/>
-              <w:t>Теріс сценарий: Дано: время поездки ещё не наступило; Когда водитель пытается закрыть поездку; Тогда система отклоняет действие.</w:t>
+              <w:t>Теріс сценарий: Given сапар уақыты әлі келмеген; When жүргізуші сапарды жабуға әрекет жасайды; Then жүйе әрекетті қабылдамайды.</w:t>
             </w:r>
           </w:p>
         </w:tc>
@@ -10797,7 +10797,7 @@
               </w:rPr>
               <w:t>Оң сценарий: Given Completed сапар; When 1–5 баға мен міндетті емес пікір жібереді; Then бір сапарға бір баға сақталып, орташа рейтинг қайта есептеледі.</w:t>
               <w:br/>
-              <w:t>Теріс сценарий: Дано: пользователь уже оценил участника за эту поездку; Когда он отправляет вторую оценку; Тогда дубликат не сохраняется.</w:t>
+              <w:t>Теріс сценарий: Given пайдаланушы осы сапардағы қатысушыны бағалап қойған; When екінші бағаны жібереді; Then қайталанған баға сақталмайды.</w:t>
             </w:r>
           </w:p>
         </w:tc>
@@ -10979,7 +10979,7 @@
               </w:rPr>
               <w:t>Оң сценарий: Given пайдаланушы сапар қатысушысы; When санат, сипаттама және қажет болса дәлел қосады; Then шағым ID алып, New күйінде модераторға түседі.</w:t>
               <w:br/>
-              <w:t>Теріс сценарий: Дано: обязательная категория или описание отсутствует; Когда пользователь отправляет жалобу; Тогда жалоба не создаётся и поля подсвечиваются.</w:t>
+              <w:t>Теріс сценарий: Given міндетті санат немесе сипаттама жоқ; When пайдаланушы шағым жібереді; Then шағым құрылмай, толтырылмаған өрістер көрсетіледі.</w:t>
             </w:r>
           </w:p>
         </w:tc>
@@ -11161,7 +11161,7 @@
               </w:rPr>
               <w:t>Оң сценарий: Given басқа пайдаланушы профилі ашық; When Бұғаттау әрекетін растайды; Then екі тарап бір-бірінің сапарларына қосыла алмайды.</w:t>
               <w:br/>
-              <w:t>Теріс сценарий: Дано: пользователь уже заблокирован; Когда блокировка отправляется повторно; Тогда дубликат не создаётся.</w:t>
+              <w:t>Теріс сценарий: Given пайдаланушы бұрын бұғатталған; When бұғаттау қайта жіберіледі; Then қайталанған жазба құрылмайды.</w:t>
             </w:r>
           </w:p>
         </w:tc>
@@ -11343,7 +11343,7 @@
               </w:rPr>
               <w:t>Оң сценарий: Given New шағым бар; When модератор шешім мен түсіндірмені сақтайды; Then мәртебе Closed болады және аудит журналында жазба пайда болады.</w:t>
               <w:br/>
-              <w:t>Теріс сценарий: Дано: роль пользователя не модератор; Когда он пытается закрыть жалобу; Тогда система возвращает 403 и не меняет жалобу.</w:t>
+              <w:t>Теріс сценарий: Given пайдаланушының рөлі модератор емес; When ол шағымды жабуға әрекет жасайды; Then жүйе 403 қайтарады және шағымды өзгертпейді.</w:t>
             </w:r>
           </w:p>
         </w:tc>
@@ -11525,7 +11525,7 @@
               </w:rPr>
               <w:t>Оң сценарий: Given оқиға жасалды; When мәртебе өзгереді; Then қолданушыға 60 секунд ішінде хабарлама жіберіліп, жеткізу нәтижесі журналға жазылады.</w:t>
               <w:br/>
-              <w:t>Теріс сценарий: Дано: сервис уведомлений временно недоступен; Когда статус меняется; Тогда выполняются три повторные попытки, а сбой записывается в журнал.</w:t>
+              <w:t>Теріс сценарий: Given хабарлама сервисі уақытша қолжетімсіз; When мәртебе өзгереді; Then үш қайта жіберу орындалып, ақау журналға жазылады.</w:t>
             </w:r>
           </w:p>
         </w:tc>
@@ -11707,7 +11707,7 @@
               </w:rPr>
               <w:t>Оң сценарий: Given жүйе ашық; When тіл ауыстырылады; Then MVP экрандарындағы барлық мәтін таңдалған тілде көрсетіліп, таңдау келесі сессияда сақталады.</w:t>
               <w:br/>
-              <w:t>Теріс сценарий: Дано: для выбранного языка отсутствует ключ перевода; Когда открывается экран; Тогда сборка или проверка локализации завершается ошибкой без пустой строки.</w:t>
+              <w:t>Теріс сценарий: Given таңдалған тіл үшін аударма кілті жоқ; When экран ашылады; Then локализация тексеруі бос жол қалдырмай қателікпен аяқталады.</w:t>
             </w:r>
           </w:p>
         </w:tc>

</xml_diff>

<commit_message>
docs: improve LZ 4 document pagination
</commit_message>
<xml_diff>
--- a/docs/requirements/lz4-enuway-requirements.docx
+++ b/docs/requirements/lz4-enuway-requirements.docx
@@ -15778,11 +15778,6 @@
       </w:pPr>
     </w:p>
     <w:p>
-      <w:r>
-        <w:br w:type="page"/>
-      </w:r>
-    </w:p>
-    <w:p>
       <w:pPr>
         <w:keepNext/>
         <w:spacing w:before="280" w:after="100"/>

</xml_diff>